<commit_message>
Release: format fixes, single page, lock doc, formatting rules
- Project title lines: right-aligned tab for dates, 4-run structure, correct content
- Education line: template spacing, non-breaking space for May 2027
- Test-Lab: space_before, professional tech stack single-run (reference style)
- Remove trailing empty paragraph (no second page), document read-only protection
- FORMATTING_RULES.md and .cursor rule: do not change font/size/spacing in future
- Scripts in scripts/, .env.example, metadata and template updates

Made-with: Cursor
</commit_message>
<xml_diff>
--- a/reference_docx/resume_optimized_final.docx
+++ b/reference_docx/resume_optimized_final.docx
@@ -23,29 +23,7 @@
           <w:sz w:val="36"/>
           <w:szCs w:val="36"/>
         </w:rPr>
-        <w:t xml:space="preserve">Dilip Kumar </w:t>
-      </w:r>
-      <w:proofErr w:type="spellStart"/>
-      <w:r>
-        <w:rPr>
-          <w:rFonts w:ascii="Times New Roman" w:eastAsia="Times New Roman" w:hAnsi="Times New Roman" w:cs="Times New Roman"/>
-          <w:b/>
-          <w:bCs/>
-          <w:sz w:val="36"/>
-          <w:szCs w:val="36"/>
-        </w:rPr>
-        <w:t>Thirukonda</w:t>
-      </w:r>
-      <w:proofErr w:type="spellEnd"/>
-      <w:r>
-        <w:rPr>
-          <w:rFonts w:ascii="Times New Roman" w:eastAsia="Times New Roman" w:hAnsi="Times New Roman" w:cs="Times New Roman"/>
-          <w:b/>
-          <w:bCs/>
-          <w:sz w:val="36"/>
-          <w:szCs w:val="36"/>
-        </w:rPr>
-        <w:t xml:space="preserve"> Chandrasekaran</w:t>
+        <w:t>Dilip Kumar Thirukonda Chandrasekaran</w:t>
       </w:r>
     </w:p>
     <w:p>
@@ -65,25 +43,7 @@
           <w:sz w:val="21"/>
           <w:szCs w:val="21"/>
         </w:rPr>
-        <w:t>Binghamton, NY | (607) 624-9390 | dthirukondac@binghamton.edu | linkedin.com/</w:t>
-      </w:r>
-      <w:proofErr w:type="spellStart"/>
-      <w:r>
-        <w:rPr>
-          <w:rFonts w:ascii="Times New Roman" w:eastAsia="Times New Roman" w:hAnsi="Times New Roman" w:cs="Times New Roman"/>
-          <w:sz w:val="21"/>
-          <w:szCs w:val="21"/>
-        </w:rPr>
-        <w:t>dilipkumartc</w:t>
-      </w:r>
-      <w:proofErr w:type="spellEnd"/>
-      <w:r>
-        <w:rPr>
-          <w:rFonts w:ascii="Times New Roman" w:eastAsia="Times New Roman" w:hAnsi="Times New Roman" w:cs="Times New Roman"/>
-          <w:sz w:val="21"/>
-          <w:szCs w:val="21"/>
-        </w:rPr>
-        <w:t xml:space="preserve"> | dilip-bing.github.io/portfolio/</w:t>
+        <w:t>Binghamton, NY | (607) 624-9390 | dthirukondac@binghamton.edu | linkedin.com/dilipkumartc | dilip-bing.github.io/portfolio/</w:t>
       </w:r>
     </w:p>
     <w:p>
@@ -508,25 +468,7 @@
           <w:sz w:val="21"/>
           <w:szCs w:val="21"/>
         </w:rPr>
-        <w:t xml:space="preserve"> Android Studio, Xcode, Gradle, Appium, Docker, GitHub, Linux/Unix, VS Code, </w:t>
-      </w:r>
-      <w:proofErr w:type="spellStart"/>
-      <w:r>
-        <w:rPr>
-          <w:rFonts w:ascii="Times New Roman" w:eastAsia="Times New Roman" w:hAnsi="Times New Roman" w:cs="Times New Roman"/>
-          <w:sz w:val="21"/>
-          <w:szCs w:val="21"/>
-        </w:rPr>
-        <w:t>Jupyter</w:t>
-      </w:r>
-      <w:proofErr w:type="spellEnd"/>
-      <w:r>
-        <w:rPr>
-          <w:rFonts w:ascii="Times New Roman" w:eastAsia="Times New Roman" w:hAnsi="Times New Roman" w:cs="Times New Roman"/>
-          <w:sz w:val="21"/>
-          <w:szCs w:val="21"/>
-        </w:rPr>
-        <w:t xml:space="preserve"> Notebook  </w:t>
+        <w:t xml:space="preserve"> Android Studio, Xcode, Gradle, Appium, Docker, GitHub, Linux/Unix, VS Code, Jupyter Notebook  </w:t>
       </w:r>
     </w:p>
     <w:p>
@@ -554,79 +496,7 @@
           <w:sz w:val="21"/>
           <w:szCs w:val="21"/>
         </w:rPr>
-        <w:t xml:space="preserve">Appium, Selenium, Espresso, </w:t>
-      </w:r>
-      <w:proofErr w:type="spellStart"/>
-      <w:r>
-        <w:rPr>
-          <w:rFonts w:ascii="Times New Roman" w:eastAsia="Times New Roman" w:hAnsi="Times New Roman" w:cs="Times New Roman"/>
-          <w:sz w:val="21"/>
-          <w:szCs w:val="21"/>
-        </w:rPr>
-        <w:t>Kaspresso</w:t>
-      </w:r>
-      <w:proofErr w:type="spellEnd"/>
-      <w:r>
-        <w:rPr>
-          <w:rFonts w:ascii="Times New Roman" w:eastAsia="Times New Roman" w:hAnsi="Times New Roman" w:cs="Times New Roman"/>
-          <w:sz w:val="21"/>
-          <w:szCs w:val="21"/>
-        </w:rPr>
-        <w:t xml:space="preserve">, </w:t>
-      </w:r>
-      <w:proofErr w:type="spellStart"/>
-      <w:r>
-        <w:rPr>
-          <w:rFonts w:ascii="Times New Roman" w:eastAsia="Times New Roman" w:hAnsi="Times New Roman" w:cs="Times New Roman"/>
-          <w:sz w:val="21"/>
-          <w:szCs w:val="21"/>
-        </w:rPr>
-        <w:t>XCTest</w:t>
-      </w:r>
-      <w:proofErr w:type="spellEnd"/>
-      <w:r>
-        <w:rPr>
-          <w:rFonts w:ascii="Times New Roman" w:eastAsia="Times New Roman" w:hAnsi="Times New Roman" w:cs="Times New Roman"/>
-          <w:sz w:val="21"/>
-          <w:szCs w:val="21"/>
-        </w:rPr>
-        <w:t xml:space="preserve">, React, MongoDB, MySQL, Firebase, </w:t>
-      </w:r>
-      <w:proofErr w:type="spellStart"/>
-      <w:r>
-        <w:rPr>
-          <w:rFonts w:ascii="Times New Roman" w:eastAsia="Times New Roman" w:hAnsi="Times New Roman" w:cs="Times New Roman"/>
-          <w:sz w:val="21"/>
-          <w:szCs w:val="21"/>
-        </w:rPr>
-        <w:t>Vercel</w:t>
-      </w:r>
-      <w:proofErr w:type="spellEnd"/>
-      <w:r>
-        <w:rPr>
-          <w:rFonts w:ascii="Times New Roman" w:eastAsia="Times New Roman" w:hAnsi="Times New Roman" w:cs="Times New Roman"/>
-          <w:sz w:val="21"/>
-          <w:szCs w:val="21"/>
-        </w:rPr>
-        <w:t xml:space="preserve">, TensorFlow, </w:t>
-      </w:r>
-      <w:proofErr w:type="spellStart"/>
-      <w:r>
-        <w:rPr>
-          <w:rFonts w:ascii="Times New Roman" w:eastAsia="Times New Roman" w:hAnsi="Times New Roman" w:cs="Times New Roman"/>
-          <w:sz w:val="21"/>
-          <w:szCs w:val="21"/>
-        </w:rPr>
-        <w:t>PyTorch</w:t>
-      </w:r>
-      <w:proofErr w:type="spellEnd"/>
-      <w:r>
-        <w:rPr>
-          <w:rFonts w:ascii="Times New Roman" w:eastAsia="Times New Roman" w:hAnsi="Times New Roman" w:cs="Times New Roman"/>
-          <w:sz w:val="21"/>
-          <w:szCs w:val="21"/>
-        </w:rPr>
-        <w:t>, JAX, ROS, SLAM, Navigation, Localization, Motion Planning, AWS</w:t>
+        <w:t>Appium, Selenium, Espresso, Kaspresso, XCTest, React, MongoDB, MySQL, Firebase, Vercel, TensorFlow, PyTorch, JAX, ROS, SLAM, Navigation, Localization, Motion Planning, AWS</w:t>
       </w:r>
     </w:p>
     <w:p>
@@ -728,9 +598,21 @@
           <w:sz w:val="21"/>
           <w:szCs w:val="21"/>
         </w:rPr>
-        <w:t xml:space="preserve">                                      January </w:t>
-      </w:r>
-      <w:proofErr w:type="gramStart"/>
+        <w:t xml:space="preserve">                                      January 2020  –  July 2025  </w:t>
+      </w:r>
+    </w:p>
+    <w:p>
+      <w:pPr>
+        <w:spacing w:after="0" w:line="240" w:lineRule="auto"/>
+        <w:ind w:right="180"/>
+        <w:rPr>
+          <w:rFonts w:ascii="Times New Roman" w:eastAsia="Times New Roman" w:hAnsi="Times New Roman" w:cs="Times New Roman"/>
+          <w:sz w:val="21"/>
+          <w:szCs w:val="21"/>
+        </w:rPr>
+      </w:pPr>
+      <w:bookmarkStart w:id="2" w:name="_heading=h.yesa4kq8uqef" w:colFirst="0" w:colLast="0"/>
+      <w:bookmarkEnd w:id="2"/>
       <w:r>
         <w:rPr>
           <w:rFonts w:ascii="Times New Roman" w:eastAsia="Times New Roman" w:hAnsi="Times New Roman" w:cs="Times New Roman"/>
@@ -739,85 +621,7 @@
           <w:sz w:val="21"/>
           <w:szCs w:val="21"/>
         </w:rPr>
-        <w:t>2020  –</w:t>
-      </w:r>
-      <w:proofErr w:type="gramEnd"/>
-      <w:r>
-        <w:rPr>
-          <w:rFonts w:ascii="Times New Roman" w:eastAsia="Times New Roman" w:hAnsi="Times New Roman" w:cs="Times New Roman"/>
-          <w:i/>
-          <w:iCs/>
-          <w:sz w:val="21"/>
-          <w:szCs w:val="21"/>
-        </w:rPr>
-        <w:t xml:space="preserve">  July 2025  </w:t>
-      </w:r>
-    </w:p>
-    <w:p>
-      <w:pPr>
-        <w:spacing w:after="0" w:line="240" w:lineRule="auto"/>
-        <w:ind w:right="180"/>
-        <w:rPr>
-          <w:rFonts w:ascii="Times New Roman" w:eastAsia="Times New Roman" w:hAnsi="Times New Roman" w:cs="Times New Roman"/>
-          <w:sz w:val="21"/>
-          <w:szCs w:val="21"/>
-        </w:rPr>
-      </w:pPr>
-      <w:bookmarkStart w:id="2" w:name="_heading=h.yesa4kq8uqef" w:colFirst="0" w:colLast="0"/>
-      <w:bookmarkEnd w:id="2"/>
-      <w:r>
-        <w:rPr>
-          <w:rFonts w:ascii="Times New Roman" w:eastAsia="Times New Roman" w:hAnsi="Times New Roman" w:cs="Times New Roman"/>
-          <w:i/>
-          <w:iCs/>
-          <w:sz w:val="21"/>
-          <w:szCs w:val="21"/>
-        </w:rPr>
-        <w:t xml:space="preserve">Tech Stack: Android SDK, C++, Gradle, Espresso, Appium, Selenium, </w:t>
-      </w:r>
-      <w:proofErr w:type="spellStart"/>
-      <w:r>
-        <w:rPr>
-          <w:rFonts w:ascii="Times New Roman" w:eastAsia="Times New Roman" w:hAnsi="Times New Roman" w:cs="Times New Roman"/>
-          <w:i/>
-          <w:iCs/>
-          <w:sz w:val="21"/>
-          <w:szCs w:val="21"/>
-        </w:rPr>
-        <w:t>XCTest</w:t>
-      </w:r>
-      <w:proofErr w:type="spellEnd"/>
-      <w:r>
-        <w:rPr>
-          <w:rFonts w:ascii="Times New Roman" w:eastAsia="Times New Roman" w:hAnsi="Times New Roman" w:cs="Times New Roman"/>
-          <w:i/>
-          <w:iCs/>
-          <w:sz w:val="21"/>
-          <w:szCs w:val="21"/>
-        </w:rPr>
-        <w:t xml:space="preserve">, </w:t>
-      </w:r>
-      <w:proofErr w:type="spellStart"/>
-      <w:r>
-        <w:rPr>
-          <w:rFonts w:ascii="Times New Roman" w:eastAsia="Times New Roman" w:hAnsi="Times New Roman" w:cs="Times New Roman"/>
-          <w:i/>
-          <w:iCs/>
-          <w:sz w:val="21"/>
-          <w:szCs w:val="21"/>
-        </w:rPr>
-        <w:t>Kaspresso</w:t>
-      </w:r>
-      <w:proofErr w:type="spellEnd"/>
-      <w:r>
-        <w:rPr>
-          <w:rFonts w:ascii="Times New Roman" w:eastAsia="Times New Roman" w:hAnsi="Times New Roman" w:cs="Times New Roman"/>
-          <w:i/>
-          <w:iCs/>
-          <w:sz w:val="21"/>
-          <w:szCs w:val="21"/>
-        </w:rPr>
-        <w:t>, React.js, MongoDB, Docker, HTML, CSS, JavaScript, PHP, Shell Script, MySQL</w:t>
+        <w:t>Tech Stack: Android SDK, C++, Gradle, Espresso, Appium, Selenium, XCTest, Kaspresso, React.js, MongoDB, Docker, HTML, CSS, JavaScript, PHP, Shell Script, MySQL</w:t>
       </w:r>
     </w:p>
     <w:p>
@@ -933,6 +737,9 @@
     </w:p>
     <w:p>
       <w:pPr>
+        <w:tabs>
+          <w:tab w:val="right" w:pos="11154"/>
+        </w:tabs>
         <w:spacing w:after="0" w:line="240" w:lineRule="auto"/>
         <w:ind w:right="180"/>
         <w:rPr>
@@ -949,7 +756,7 @@
           <w:sz w:val="21"/>
           <w:szCs w:val="21"/>
         </w:rPr>
-        <w:t xml:space="preserve">Test-Lab, </w:t>
+        <w:t xml:space="preserve">LLM-Native Web Automation Framework, </w:t>
       </w:r>
       <w:r>
         <w:rPr>
@@ -959,15 +766,15 @@
           <w:sz w:val="21"/>
           <w:szCs w:val="21"/>
         </w:rPr>
-        <w:t xml:space="preserve">Team Lead &amp; Co-Developer </w:t>
-      </w:r>
-      <w:r>
-        <w:rPr>
-          <w:rFonts w:ascii="Times New Roman" w:eastAsia="Times New Roman" w:hAnsi="Times New Roman" w:cs="Times New Roman"/>
-          <w:sz w:val="21"/>
-          <w:szCs w:val="21"/>
-        </w:rPr>
-        <w:t xml:space="preserve">                </w:t>
+        <w:t>Independent Open-Source Project</w:t>
+      </w:r>
+      <w:r>
+        <w:rPr>
+          <w:rFonts w:ascii="Times New Roman" w:eastAsia="Times New Roman" w:hAnsi="Times New Roman" w:cs="Times New Roman"/>
+          <w:sz w:val="21"/>
+          <w:szCs w:val="21"/>
+        </w:rPr>
+        <w:t xml:space="preserve">                                                          </w:t>
       </w:r>
       <w:r>
         <w:rPr>
@@ -977,26 +784,7 @@
           <w:sz w:val="21"/>
           <w:szCs w:val="21"/>
         </w:rPr>
-        <w:t xml:space="preserve">      </w:t>
-      </w:r>
-      <w:r>
-        <w:rPr>
-          <w:rFonts w:ascii="Times New Roman" w:eastAsia="Times New Roman" w:hAnsi="Times New Roman" w:cs="Times New Roman"/>
-          <w:i/>
-          <w:iCs/>
-          <w:sz w:val="21"/>
-          <w:szCs w:val="21"/>
-        </w:rPr>
-        <w:tab/>
-        <w:t xml:space="preserve">                                                                      September 2024 – July 2025</w:t>
-      </w:r>
-      <w:r>
-        <w:rPr>
-          <w:rFonts w:ascii="Times New Roman" w:eastAsia="Times New Roman" w:hAnsi="Times New Roman" w:cs="Times New Roman"/>
-          <w:sz w:val="21"/>
-          <w:szCs w:val="21"/>
-        </w:rPr>
-        <w:t xml:space="preserve">       </w:t>
+        <w:t>February 2026</w:t>
       </w:r>
     </w:p>
     <w:p>
@@ -1070,6 +858,9 @@
     </w:p>
     <w:p>
       <w:pPr>
+        <w:tabs>
+          <w:tab w:val="right" w:pos="11154"/>
+        </w:tabs>
         <w:spacing w:after="0" w:line="240" w:lineRule="auto"/>
         <w:ind w:right="180"/>
         <w:rPr>
@@ -1086,15 +877,7 @@
           <w:sz w:val="21"/>
           <w:szCs w:val="21"/>
         </w:rPr>
-        <w:t>3D Printer &amp; Scanner,</w:t>
-      </w:r>
-      <w:r>
-        <w:rPr>
-          <w:rFonts w:ascii="Times New Roman" w:eastAsia="Times New Roman" w:hAnsi="Times New Roman" w:cs="Times New Roman"/>
-          <w:sz w:val="21"/>
-          <w:szCs w:val="21"/>
-        </w:rPr>
-        <w:t xml:space="preserve"> </w:t>
+        <w:t xml:space="preserve">Neuro-Symbolic Planning via Adversarial Repair and Compilation, </w:t>
       </w:r>
       <w:r>
         <w:rPr>
@@ -1104,25 +887,15 @@
           <w:sz w:val="21"/>
           <w:szCs w:val="21"/>
         </w:rPr>
-        <w:t>Team Project</w:t>
-      </w:r>
-      <w:r>
-        <w:rPr>
-          <w:rFonts w:ascii="Times New Roman" w:eastAsia="Times New Roman" w:hAnsi="Times New Roman" w:cs="Times New Roman"/>
-          <w:b/>
-          <w:bCs/>
-          <w:sz w:val="21"/>
-          <w:szCs w:val="21"/>
-        </w:rPr>
-        <w:tab/>
-      </w:r>
-      <w:r>
-        <w:rPr>
-          <w:rFonts w:ascii="Times New Roman" w:eastAsia="Times New Roman" w:hAnsi="Times New Roman" w:cs="Times New Roman"/>
-          <w:sz w:val="21"/>
-          <w:szCs w:val="21"/>
-        </w:rPr>
-        <w:t xml:space="preserve">                 </w:t>
+        <w:t>Individual Project</w:t>
+      </w:r>
+      <w:r>
+        <w:rPr>
+          <w:rFonts w:ascii="Times New Roman" w:eastAsia="Times New Roman" w:hAnsi="Times New Roman" w:cs="Times New Roman"/>
+          <w:sz w:val="21"/>
+          <w:szCs w:val="21"/>
+        </w:rPr>
+        <w:t xml:space="preserve">                            </w:t>
       </w:r>
       <w:r>
         <w:rPr>
@@ -1132,68 +905,7 @@
           <w:sz w:val="21"/>
           <w:szCs w:val="21"/>
         </w:rPr>
-        <w:t xml:space="preserve">      </w:t>
-      </w:r>
-      <w:r>
-        <w:rPr>
-          <w:rFonts w:ascii="Times New Roman" w:eastAsia="Times New Roman" w:hAnsi="Times New Roman" w:cs="Times New Roman"/>
-          <w:i/>
-          <w:iCs/>
-          <w:sz w:val="21"/>
-          <w:szCs w:val="21"/>
-        </w:rPr>
-        <w:tab/>
-      </w:r>
-      <w:r>
-        <w:rPr>
-          <w:rFonts w:ascii="Times New Roman" w:eastAsia="Times New Roman" w:hAnsi="Times New Roman" w:cs="Times New Roman"/>
-          <w:i/>
-          <w:iCs/>
-          <w:sz w:val="21"/>
-          <w:szCs w:val="21"/>
-        </w:rPr>
-        <w:tab/>
-      </w:r>
-      <w:r>
-        <w:rPr>
-          <w:rFonts w:ascii="Times New Roman" w:eastAsia="Times New Roman" w:hAnsi="Times New Roman" w:cs="Times New Roman"/>
-          <w:i/>
-          <w:iCs/>
-          <w:sz w:val="21"/>
-          <w:szCs w:val="21"/>
-        </w:rPr>
-        <w:tab/>
-        <w:t xml:space="preserve">          </w:t>
-      </w:r>
-      <w:r>
-        <w:rPr>
-          <w:rFonts w:ascii="Times New Roman" w:eastAsia="Times New Roman" w:hAnsi="Times New Roman" w:cs="Times New Roman"/>
-          <w:i/>
-          <w:iCs/>
-          <w:sz w:val="21"/>
-          <w:szCs w:val="21"/>
-        </w:rPr>
-        <w:tab/>
-        <w:t xml:space="preserve">             </w:t>
-      </w:r>
-      <w:r>
-        <w:rPr>
-          <w:rFonts w:ascii="Times New Roman" w:eastAsia="Times New Roman" w:hAnsi="Times New Roman" w:cs="Times New Roman"/>
-          <w:i/>
-          <w:iCs/>
-          <w:sz w:val="21"/>
-          <w:szCs w:val="21"/>
-        </w:rPr>
-        <w:tab/>
-        <w:t xml:space="preserve">         January 2019 – February 2019</w:t>
-      </w:r>
-      <w:r>
-        <w:rPr>
-          <w:rFonts w:ascii="Times New Roman" w:eastAsia="Times New Roman" w:hAnsi="Times New Roman" w:cs="Times New Roman"/>
-          <w:sz w:val="21"/>
-          <w:szCs w:val="21"/>
-        </w:rPr>
-        <w:t xml:space="preserve">    </w:t>
+        <w:t>January 2026 – Present</w:t>
       </w:r>
     </w:p>
     <w:p>
@@ -1276,7 +988,10 @@
     </w:p>
     <w:p>
       <w:pPr>
-        <w:spacing w:before="60" w:after="0" w:line="240" w:lineRule="auto"/>
+        <w:tabs>
+          <w:tab w:val="right" w:pos="11154"/>
+        </w:tabs>
+        <w:spacing w:after="0" w:line="240" w:lineRule="auto"/>
         <w:ind w:right="180"/>
         <w:rPr>
           <w:rFonts w:ascii="Times New Roman" w:eastAsia="Times New Roman" w:hAnsi="Times New Roman" w:cs="Times New Roman"/>
@@ -1292,7 +1007,7 @@
           <w:sz w:val="21"/>
           <w:szCs w:val="21"/>
         </w:rPr>
-        <w:t xml:space="preserve">Obstacle Avoiding Robot, </w:t>
+        <w:t xml:space="preserve">Natural Language to Behavior Tree Compiler, </w:t>
       </w:r>
       <w:r>
         <w:rPr>
@@ -1302,7 +1017,15 @@
           <w:sz w:val="21"/>
           <w:szCs w:val="21"/>
         </w:rPr>
-        <w:t xml:space="preserve">Team Project     </w:t>
+        <w:t>Team Project</w:t>
+      </w:r>
+      <w:r>
+        <w:rPr>
+          <w:rFonts w:ascii="Times New Roman" w:eastAsia="Times New Roman" w:hAnsi="Times New Roman" w:cs="Times New Roman"/>
+          <w:sz w:val="21"/>
+          <w:szCs w:val="21"/>
+        </w:rPr>
+        <w:t xml:space="preserve">                                                                        </w:t>
       </w:r>
       <w:r>
         <w:rPr>
@@ -1312,57 +1035,7 @@
           <w:sz w:val="21"/>
           <w:szCs w:val="21"/>
         </w:rPr>
-        <w:tab/>
-      </w:r>
-      <w:r>
-        <w:rPr>
-          <w:rFonts w:ascii="Times New Roman" w:eastAsia="Times New Roman" w:hAnsi="Times New Roman" w:cs="Times New Roman"/>
-          <w:i/>
-          <w:iCs/>
-          <w:sz w:val="21"/>
-          <w:szCs w:val="21"/>
-        </w:rPr>
-        <w:tab/>
-      </w:r>
-      <w:r>
-        <w:rPr>
-          <w:rFonts w:ascii="Times New Roman" w:eastAsia="Times New Roman" w:hAnsi="Times New Roman" w:cs="Times New Roman"/>
-          <w:i/>
-          <w:iCs/>
-          <w:sz w:val="21"/>
-          <w:szCs w:val="21"/>
-        </w:rPr>
-        <w:tab/>
-      </w:r>
-      <w:r>
-        <w:rPr>
-          <w:rFonts w:ascii="Times New Roman" w:eastAsia="Times New Roman" w:hAnsi="Times New Roman" w:cs="Times New Roman"/>
-          <w:i/>
-          <w:iCs/>
-          <w:sz w:val="21"/>
-          <w:szCs w:val="21"/>
-        </w:rPr>
-        <w:tab/>
-        <w:t xml:space="preserve">   </w:t>
-      </w:r>
-      <w:r>
-        <w:rPr>
-          <w:rFonts w:ascii="Times New Roman" w:eastAsia="Times New Roman" w:hAnsi="Times New Roman" w:cs="Times New Roman"/>
-          <w:i/>
-          <w:iCs/>
-          <w:sz w:val="21"/>
-          <w:szCs w:val="21"/>
-        </w:rPr>
-        <w:tab/>
-        <w:t xml:space="preserve">                       October 2016 – November 2016</w:t>
-      </w:r>
-      <w:r>
-        <w:rPr>
-          <w:rFonts w:ascii="Times New Roman" w:eastAsia="Times New Roman" w:hAnsi="Times New Roman" w:cs="Times New Roman"/>
-          <w:sz w:val="21"/>
-          <w:szCs w:val="21"/>
-        </w:rPr>
-        <w:t xml:space="preserve">   </w:t>
+        <w:t>January 2026 – Present</w:t>
       </w:r>
     </w:p>
     <w:p>
@@ -1456,6 +1129,8 @@
         <w:ind w:right="180"/>
         <w:rPr>
           <w:rFonts w:ascii="Times New Roman" w:eastAsia="Times New Roman" w:hAnsi="Times New Roman" w:cs="Times New Roman"/>
+          <w:i/>
+          <w:iCs/>
           <w:sz w:val="21"/>
           <w:szCs w:val="21"/>
         </w:rPr>
@@ -1468,15 +1143,7 @@
           <w:sz w:val="21"/>
           <w:szCs w:val="21"/>
         </w:rPr>
-        <w:t>Earthworm - Plant and Disease Detection System,</w:t>
-      </w:r>
-      <w:r>
-        <w:rPr>
-          <w:rFonts w:ascii="Times New Roman" w:eastAsia="Times New Roman" w:hAnsi="Times New Roman" w:cs="Times New Roman"/>
-          <w:sz w:val="21"/>
-          <w:szCs w:val="21"/>
-        </w:rPr>
-        <w:t xml:space="preserve"> </w:t>
+        <w:t xml:space="preserve">Test-Lab, </w:t>
       </w:r>
       <w:r>
         <w:rPr>
@@ -1486,25 +1153,15 @@
           <w:sz w:val="21"/>
           <w:szCs w:val="21"/>
         </w:rPr>
-        <w:t>Team Project</w:t>
-      </w:r>
-      <w:r>
-        <w:rPr>
-          <w:rFonts w:ascii="Times New Roman" w:eastAsia="Times New Roman" w:hAnsi="Times New Roman" w:cs="Times New Roman"/>
-          <w:b/>
-          <w:bCs/>
-          <w:sz w:val="21"/>
-          <w:szCs w:val="21"/>
-        </w:rPr>
-        <w:tab/>
-      </w:r>
-      <w:r>
-        <w:rPr>
-          <w:rFonts w:ascii="Times New Roman" w:eastAsia="Times New Roman" w:hAnsi="Times New Roman" w:cs="Times New Roman"/>
-          <w:sz w:val="21"/>
-          <w:szCs w:val="21"/>
-        </w:rPr>
-        <w:t xml:space="preserve">                 </w:t>
+        <w:t>Team Lead &amp; Co-Developer</w:t>
+      </w:r>
+      <w:r>
+        <w:rPr>
+          <w:rFonts w:ascii="Times New Roman" w:eastAsia="Times New Roman" w:hAnsi="Times New Roman" w:cs="Times New Roman"/>
+          <w:sz w:val="21"/>
+          <w:szCs w:val="21"/>
+        </w:rPr>
+        <w:t xml:space="preserve">                                                                                                       </w:t>
       </w:r>
       <w:r>
         <w:rPr>
@@ -1514,34 +1171,17 @@
           <w:sz w:val="21"/>
           <w:szCs w:val="21"/>
         </w:rPr>
-        <w:t xml:space="preserve">      </w:t>
-      </w:r>
-      <w:r>
+        <w:t>September 2024 – July 2025</w:t>
+      </w:r>
+    </w:p>
+    <w:p>
+      <w:pPr>
+        <w:spacing w:after="0" w:line="240" w:lineRule="auto"/>
+        <w:ind w:right="180"/>
         <w:rPr>
           <w:rFonts w:ascii="Times New Roman" w:eastAsia="Times New Roman" w:hAnsi="Times New Roman" w:cs="Times New Roman"/>
           <w:i/>
           <w:iCs/>
-          <w:sz w:val="21"/>
-          <w:szCs w:val="21"/>
-        </w:rPr>
-        <w:tab/>
-        <w:t xml:space="preserve">                                                September 2018</w:t>
-      </w:r>
-      <w:r>
-        <w:rPr>
-          <w:rFonts w:ascii="Times New Roman" w:eastAsia="Times New Roman" w:hAnsi="Times New Roman" w:cs="Times New Roman"/>
-          <w:sz w:val="21"/>
-          <w:szCs w:val="21"/>
-        </w:rPr>
-        <w:t xml:space="preserve">  </w:t>
-      </w:r>
-    </w:p>
-    <w:p>
-      <w:pPr>
-        <w:spacing w:after="0" w:line="240" w:lineRule="auto"/>
-        <w:ind w:right="180"/>
-        <w:rPr>
-          <w:rFonts w:ascii="Times New Roman" w:eastAsia="Times New Roman" w:hAnsi="Times New Roman" w:cs="Times New Roman"/>
           <w:sz w:val="21"/>
           <w:szCs w:val="21"/>
         </w:rPr>
@@ -1713,7 +1353,6 @@
           <w:szCs w:val="21"/>
         </w:rPr>
       </w:pPr>
-      <w:proofErr w:type="spellStart"/>
       <w:r>
         <w:rPr>
           <w:rFonts w:ascii="Times New Roman" w:eastAsia="Times New Roman" w:hAnsi="Times New Roman" w:cs="Times New Roman"/>
@@ -1722,18 +1361,7 @@
           <w:sz w:val="21"/>
           <w:szCs w:val="21"/>
         </w:rPr>
-        <w:t>Jambav</w:t>
-      </w:r>
-      <w:proofErr w:type="spellEnd"/>
-      <w:r>
-        <w:rPr>
-          <w:rFonts w:ascii="Times New Roman" w:eastAsia="Times New Roman" w:hAnsi="Times New Roman" w:cs="Times New Roman"/>
-          <w:b/>
-          <w:bCs/>
-          <w:sz w:val="21"/>
-          <w:szCs w:val="21"/>
-        </w:rPr>
-        <w:t xml:space="preserve"> Zoho Corporation, </w:t>
+        <w:t xml:space="preserve">Jambav Zoho Corporation, </w:t>
       </w:r>
       <w:r>
         <w:rPr>
@@ -3702,6 +3330,7 @@
   <w:style w:type="character" w:default="1" w:styleId="DefaultParagraphFont">
     <w:name w:val="Default Paragraph Font"/>
     <w:uiPriority w:val="1"/>
+    <w:semiHidden/>
     <w:unhideWhenUsed/>
   </w:style>
   <w:style w:type="table" w:default="1" w:styleId="TableNormal">

</xml_diff>